<commit_message>
docs: add /docs directory, update proposal & planning
</commit_message>
<xml_diff>
--- a/HMS_Proposal.docx
+++ b/HMS_Proposal.docx
@@ -1271,6 +1271,92 @@
                 <w:szCs w:val="20"/>
               </w:rPr>
               <w:t xml:space="preserve">Real-time dashboards. Operational insights. Compliance reporting. Population health management.</w:t>
+            </w:r>
+          </w:p>
+        </w:tc>
+      </w:tr>
+      <w:tr>
+        <w:tc>
+          <w:tcPr>
+            <w:tcW w:type="dxa" w:w="4680"/>
+            <w:tcBorders>
+              <w:top w:val="single" w:color="D5D8DC" w:sz="1"/>
+              <w:left w:val="single" w:color="D5D8DC" w:sz="1"/>
+              <w:bottom w:val="single" w:color="D5D8DC" w:sz="1"/>
+              <w:right w:val="single" w:color="D5D8DC" w:sz="1"/>
+            </w:tcBorders>
+            <w:shd w:fill="FFFFFF" w:val="clear"/>
+            <w:tcMar>
+              <w:top w:type="dxa" w:w="100"/>
+              <w:left w:type="dxa" w:w="150"/>
+              <w:bottom w:type="dxa" w:w="100"/>
+              <w:right w:type="dxa" w:w="150"/>
+            </w:tcMar>
+          </w:tcPr>
+          <w:p>
+            <w:pPr>
+              <w:spacing w:after="80"/>
+            </w:pPr>
+            <w:r>
+              <w:rPr>
+                <w:b/>
+                <w:bCs/>
+                <w:color w:val="1B4F72"/>
+                <w:sz w:val="22"/>
+                <w:szCs w:val="22"/>
+              </w:rPr>
+              <w:t xml:space="preserve">Staff Attendance &amp; Scheduling</w:t>
+            </w:r>
+          </w:p>
+          <w:p>
+            <w:r>
+              <w:rPr>
+                <w:sz w:val="20"/>
+                <w:szCs w:val="20"/>
+              </w:rPr>
+              <w:t xml:space="preserve">Web-based clock-in with IP/location tracking. Shift management, overtime calculation, leave requests, and shift swaps. Auto-notify managers.</w:t>
+            </w:r>
+          </w:p>
+        </w:tc>
+        <w:tc>
+          <w:tcPr>
+            <w:tcW w:type="dxa" w:w="4680"/>
+            <w:tcBorders>
+              <w:top w:val="single" w:color="D5D8DC" w:sz="1"/>
+              <w:left w:val="single" w:color="D5D8DC" w:sz="1"/>
+              <w:bottom w:val="single" w:color="D5D8DC" w:sz="1"/>
+              <w:right w:val="single" w:color="D5D8DC" w:sz="1"/>
+            </w:tcBorders>
+            <w:shd w:fill="FFFFFF" w:val="clear"/>
+            <w:tcMar>
+              <w:top w:type="dxa" w:w="100"/>
+              <w:left w:type="dxa" w:w="150"/>
+              <w:bottom w:type="dxa" w:w="100"/>
+              <w:right w:type="dxa" w:w="150"/>
+            </w:tcMar>
+          </w:tcPr>
+          <w:p>
+            <w:pPr>
+              <w:spacing w:after="80"/>
+            </w:pPr>
+            <w:r>
+              <w:rPr>
+                <w:b/>
+                <w:bCs/>
+                <w:color w:val="1B4F72"/>
+                <w:sz w:val="22"/>
+                <w:szCs w:val="22"/>
+              </w:rPr>
+              <w:t xml:space="preserve">Servicom (Customer Service)</w:t>
+            </w:r>
+          </w:p>
+          <w:p>
+            <w:r>
+              <w:rPr>
+                <w:sz w:val="20"/>
+                <w:szCs w:val="20"/>
+              </w:rPr>
+              <w:t xml:space="preserve">Full complaint lifecycle tracking. Multi-channel intake (web, SMS, email). Auto-escalation SLA. Post-visit surveys and feedback collection.</w:t>
             </w:r>
           </w:p>
         </w:tc>
@@ -3018,6 +3104,242 @@
           </w:p>
         </w:tc>
       </w:tr>
+      <w:tr>
+        <w:tc>
+          <w:tcPr>
+            <w:tcW w:type="dxa" w:w="780"/>
+            <w:tcBorders>
+              <w:top w:val="single" w:color="D5D8DC" w:sz="1"/>
+              <w:left w:val="single" w:color="D5D8DC" w:sz="1"/>
+              <w:bottom w:val="single" w:color="D5D8DC" w:sz="1"/>
+              <w:right w:val="single" w:color="D5D8DC" w:sz="1"/>
+            </w:tcBorders>
+            <w:shd w:fill="EBF5FB" w:val="clear"/>
+            <w:tcMar>
+              <w:top w:type="dxa" w:w="100"/>
+              <w:left w:type="dxa" w:w="150"/>
+              <w:bottom w:type="dxa" w:w="100"/>
+              <w:right w:type="dxa" w:w="150"/>
+            </w:tcMar>
+          </w:tcPr>
+          <w:p>
+            <w:pPr>
+              <w:jc w:val="center"/>
+            </w:pPr>
+            <w:r>
+              <w:rPr>
+                <w:b/>
+                <w:bCs/>
+                <w:sz w:val="20"/>
+                <w:szCs w:val="20"/>
+              </w:rPr>
+              <w:t xml:space="preserve">9</w:t>
+            </w:r>
+          </w:p>
+        </w:tc>
+        <w:tc>
+          <w:tcPr>
+            <w:tcW w:type="dxa" w:w="3120"/>
+            <w:tcBorders>
+              <w:top w:val="single" w:color="D5D8DC" w:sz="1"/>
+              <w:left w:val="single" w:color="D5D8DC" w:sz="1"/>
+              <w:bottom w:val="single" w:color="D5D8DC" w:sz="1"/>
+              <w:right w:val="single" w:color="D5D8DC" w:sz="1"/>
+            </w:tcBorders>
+            <w:shd w:fill="EBF5FB" w:val="clear"/>
+            <w:tcMar>
+              <w:top w:type="dxa" w:w="100"/>
+              <w:left w:type="dxa" w:w="150"/>
+              <w:bottom w:type="dxa" w:w="100"/>
+              <w:right w:type="dxa" w:w="150"/>
+            </w:tcMar>
+          </w:tcPr>
+          <w:p>
+            <w:r>
+              <w:rPr>
+                <w:sz w:val="20"/>
+                <w:szCs w:val="20"/>
+              </w:rPr>
+              <w:t xml:space="preserve">Staff Attendance</w:t>
+            </w:r>
+          </w:p>
+        </w:tc>
+        <w:tc>
+          <w:tcPr>
+            <w:tcW w:type="dxa" w:w="3120"/>
+            <w:tcBorders>
+              <w:top w:val="single" w:color="D5D8DC" w:sz="1"/>
+              <w:left w:val="single" w:color="D5D8DC" w:sz="1"/>
+              <w:bottom w:val="single" w:color="D5D8DC" w:sz="1"/>
+              <w:right w:val="single" w:color="D5D8DC" w:sz="1"/>
+            </w:tcBorders>
+            <w:shd w:fill="EBF5FB" w:val="clear"/>
+            <w:tcMar>
+              <w:top w:type="dxa" w:w="100"/>
+              <w:left w:type="dxa" w:w="150"/>
+              <w:bottom w:type="dxa" w:w="100"/>
+              <w:right w:type="dxa" w:w="150"/>
+            </w:tcMar>
+          </w:tcPr>
+          <w:p>
+            <w:r>
+              <w:rPr>
+                <w:sz w:val="20"/>
+                <w:szCs w:val="20"/>
+              </w:rPr>
+              <w:t xml:space="preserve">Clock-in/out, shift management, overtime, leave, shift swaps</w:t>
+            </w:r>
+          </w:p>
+        </w:tc>
+        <w:tc>
+          <w:tcPr>
+            <w:tcW w:type="dxa" w:w="2340"/>
+            <w:tcBorders>
+              <w:top w:val="single" w:color="D5D8DC" w:sz="1"/>
+              <w:left w:val="single" w:color="D5D8DC" w:sz="1"/>
+              <w:bottom w:val="single" w:color="D5D8DC" w:sz="1"/>
+              <w:right w:val="single" w:color="D5D8DC" w:sz="1"/>
+            </w:tcBorders>
+            <w:shd w:fill="EBF5FB" w:val="clear"/>
+            <w:tcMar>
+              <w:top w:type="dxa" w:w="100"/>
+              <w:left w:type="dxa" w:w="150"/>
+              <w:bottom w:type="dxa" w:w="100"/>
+              <w:right w:type="dxa" w:w="150"/>
+            </w:tcMar>
+          </w:tcPr>
+          <w:p>
+            <w:pPr>
+              <w:jc w:val="center"/>
+            </w:pPr>
+            <w:r>
+              <w:rPr>
+                <w:sz w:val="20"/>
+                <w:szCs w:val="20"/>
+              </w:rPr>
+              <w:t xml:space="preserve">3 weeks</w:t>
+            </w:r>
+          </w:p>
+        </w:tc>
+      </w:tr>
+      <w:tr>
+        <w:tc>
+          <w:tcPr>
+            <w:tcW w:type="dxa" w:w="780"/>
+            <w:tcBorders>
+              <w:top w:val="single" w:color="D5D8DC" w:sz="1"/>
+              <w:left w:val="single" w:color="D5D8DC" w:sz="1"/>
+              <w:bottom w:val="single" w:color="D5D8DC" w:sz="1"/>
+              <w:right w:val="single" w:color="D5D8DC" w:sz="1"/>
+            </w:tcBorders>
+            <w:shd w:fill="FFFFFF" w:val="clear"/>
+            <w:tcMar>
+              <w:top w:type="dxa" w:w="100"/>
+              <w:left w:type="dxa" w:w="150"/>
+              <w:bottom w:type="dxa" w:w="100"/>
+              <w:right w:type="dxa" w:w="150"/>
+            </w:tcMar>
+          </w:tcPr>
+          <w:p>
+            <w:pPr>
+              <w:jc w:val="center"/>
+            </w:pPr>
+            <w:r>
+              <w:rPr>
+                <w:b/>
+                <w:bCs/>
+                <w:sz w:val="20"/>
+                <w:szCs w:val="20"/>
+              </w:rPr>
+              <w:t xml:space="preserve">10</w:t>
+            </w:r>
+          </w:p>
+        </w:tc>
+        <w:tc>
+          <w:tcPr>
+            <w:tcW w:type="dxa" w:w="3120"/>
+            <w:tcBorders>
+              <w:top w:val="single" w:color="D5D8DC" w:sz="1"/>
+              <w:left w:val="single" w:color="D5D8DC" w:sz="1"/>
+              <w:bottom w:val="single" w:color="D5D8DC" w:sz="1"/>
+              <w:right w:val="single" w:color="D5D8DC" w:sz="1"/>
+            </w:tcBorders>
+            <w:shd w:fill="FFFFFF" w:val="clear"/>
+            <w:tcMar>
+              <w:top w:type="dxa" w:w="100"/>
+              <w:left w:type="dxa" w:w="150"/>
+              <w:bottom w:type="dxa" w:w="100"/>
+              <w:right w:type="dxa" w:w="150"/>
+            </w:tcMar>
+          </w:tcPr>
+          <w:p>
+            <w:r>
+              <w:rPr>
+                <w:sz w:val="20"/>
+                <w:szCs w:val="20"/>
+              </w:rPr>
+              <w:t xml:space="preserve">Servicom</w:t>
+            </w:r>
+          </w:p>
+        </w:tc>
+        <w:tc>
+          <w:tcPr>
+            <w:tcW w:type="dxa" w:w="3120"/>
+            <w:tcBorders>
+              <w:top w:val="single" w:color="D5D8DC" w:sz="1"/>
+              <w:left w:val="single" w:color="D5D8DC" w:sz="1"/>
+              <w:bottom w:val="single" w:color="D5D8DC" w:sz="1"/>
+              <w:right w:val="single" w:color="D5D8DC" w:sz="1"/>
+            </w:tcBorders>
+            <w:shd w:fill="FFFFFF" w:val="clear"/>
+            <w:tcMar>
+              <w:top w:type="dxa" w:w="100"/>
+              <w:left w:type="dxa" w:w="150"/>
+              <w:bottom w:type="dxa" w:w="100"/>
+              <w:right w:type="dxa" w:w="150"/>
+            </w:tcMar>
+          </w:tcPr>
+          <w:p>
+            <w:r>
+              <w:rPr>
+                <w:sz w:val="20"/>
+                <w:szCs w:val="20"/>
+              </w:rPr>
+              <w:t xml:space="preserve">Complaints, feedback, surveys, SLA escalation</w:t>
+            </w:r>
+          </w:p>
+        </w:tc>
+        <w:tc>
+          <w:tcPr>
+            <w:tcW w:type="dxa" w:w="2340"/>
+            <w:tcBorders>
+              <w:top w:val="single" w:color="D5D8DC" w:sz="1"/>
+              <w:left w:val="single" w:color="D5D8DC" w:sz="1"/>
+              <w:bottom w:val="single" w:color="D5D8DC" w:sz="1"/>
+              <w:right w:val="single" w:color="D5D8DC" w:sz="1"/>
+            </w:tcBorders>
+            <w:shd w:fill="FFFFFF" w:val="clear"/>
+            <w:tcMar>
+              <w:top w:type="dxa" w:w="100"/>
+              <w:left w:type="dxa" w:w="150"/>
+              <w:bottom w:type="dxa" w:w="100"/>
+              <w:right w:type="dxa" w:w="150"/>
+            </w:tcMar>
+          </w:tcPr>
+          <w:p>
+            <w:pPr>
+              <w:jc w:val="center"/>
+            </w:pPr>
+            <w:r>
+              <w:rPr>
+                <w:sz w:val="20"/>
+                <w:szCs w:val="20"/>
+              </w:rPr>
+              <w:t xml:space="preserve">3 weeks</w:t>
+            </w:r>
+          </w:p>
+        </w:tc>
+      </w:tr>
     </w:tbl>
     <w:p>
       <w:pPr>
@@ -3408,6 +3730,124 @@
                 <w:szCs w:val="20"/>
               </w:rPr>
               <w:t xml:space="preserve">25% improvement</w:t>
+            </w:r>
+          </w:p>
+        </w:tc>
+      </w:tr>
+      <w:tr>
+        <w:tc>
+          <w:tcPr>
+            <w:tcW w:type="dxa" w:w="4680"/>
+            <w:tcBorders>
+              <w:top w:val="single" w:color="D5D8DC" w:sz="1"/>
+              <w:left w:val="single" w:color="D5D8DC" w:sz="1"/>
+              <w:bottom w:val="single" w:color="D5D8DC" w:sz="1"/>
+              <w:right w:val="single" w:color="D5D8DC" w:sz="1"/>
+            </w:tcBorders>
+            <w:shd w:fill="FFFFFF" w:val="clear"/>
+            <w:tcMar>
+              <w:top w:type="dxa" w:w="100"/>
+              <w:left w:type="dxa" w:w="150"/>
+              <w:bottom w:type="dxa" w:w="100"/>
+              <w:right w:type="dxa" w:w="150"/>
+            </w:tcMar>
+          </w:tcPr>
+          <w:p>
+            <w:r>
+              <w:rPr>
+                <w:sz w:val="20"/>
+                <w:szCs w:val="20"/>
+              </w:rPr>
+              <w:t xml:space="preserve">Attendance Admin Overhead</w:t>
+            </w:r>
+          </w:p>
+        </w:tc>
+        <w:tc>
+          <w:tcPr>
+            <w:tcW w:type="dxa" w:w="4680"/>
+            <w:tcBorders>
+              <w:top w:val="single" w:color="D5D8DC" w:sz="1"/>
+              <w:left w:val="single" w:color="D5D8DC" w:sz="1"/>
+              <w:bottom w:val="single" w:color="D5D8DC" w:sz="1"/>
+              <w:right w:val="single" w:color="D5D8DC" w:sz="1"/>
+            </w:tcBorders>
+            <w:shd w:fill="FFFFFF" w:val="clear"/>
+            <w:tcMar>
+              <w:top w:type="dxa" w:w="100"/>
+              <w:left w:type="dxa" w:w="150"/>
+              <w:bottom w:type="dxa" w:w="100"/>
+              <w:right w:type="dxa" w:w="150"/>
+            </w:tcMar>
+          </w:tcPr>
+          <w:p>
+            <w:r>
+              <w:rPr>
+                <w:b/>
+                <w:bCs/>
+                <w:color w:val="1B4F72"/>
+                <w:sz w:val="20"/>
+                <w:szCs w:val="20"/>
+              </w:rPr>
+              <w:t xml:space="preserve">70% reduction (automated tracking)</w:t>
+            </w:r>
+          </w:p>
+        </w:tc>
+      </w:tr>
+      <w:tr>
+        <w:tc>
+          <w:tcPr>
+            <w:tcW w:type="dxa" w:w="4680"/>
+            <w:tcBorders>
+              <w:top w:val="single" w:color="D5D8DC" w:sz="1"/>
+              <w:left w:val="single" w:color="D5D8DC" w:sz="1"/>
+              <w:bottom w:val="single" w:color="D5D8DC" w:sz="1"/>
+              <w:right w:val="single" w:color="D5D8DC" w:sz="1"/>
+            </w:tcBorders>
+            <w:shd w:fill="EBF5FB" w:val="clear"/>
+            <w:tcMar>
+              <w:top w:type="dxa" w:w="100"/>
+              <w:left w:type="dxa" w:w="150"/>
+              <w:bottom w:type="dxa" w:w="100"/>
+              <w:right w:type="dxa" w:w="150"/>
+            </w:tcMar>
+          </w:tcPr>
+          <w:p>
+            <w:r>
+              <w:rPr>
+                <w:sz w:val="20"/>
+                <w:szCs w:val="20"/>
+              </w:rPr>
+              <w:t xml:space="preserve">Complaint Resolution Time</w:t>
+            </w:r>
+          </w:p>
+        </w:tc>
+        <w:tc>
+          <w:tcPr>
+            <w:tcW w:type="dxa" w:w="4680"/>
+            <w:tcBorders>
+              <w:top w:val="single" w:color="D5D8DC" w:sz="1"/>
+              <w:left w:val="single" w:color="D5D8DC" w:sz="1"/>
+              <w:bottom w:val="single" w:color="D5D8DC" w:sz="1"/>
+              <w:right w:val="single" w:color="D5D8DC" w:sz="1"/>
+            </w:tcBorders>
+            <w:shd w:fill="EBF5FB" w:val="clear"/>
+            <w:tcMar>
+              <w:top w:type="dxa" w:w="100"/>
+              <w:left w:type="dxa" w:w="150"/>
+              <w:bottom w:type="dxa" w:w="100"/>
+              <w:right w:type="dxa" w:w="150"/>
+            </w:tcMar>
+          </w:tcPr>
+          <w:p>
+            <w:r>
+              <w:rPr>
+                <w:b/>
+                <w:bCs/>
+                <w:color w:val="1B4F72"/>
+                <w:sz w:val="20"/>
+                <w:szCs w:val="20"/>
+              </w:rPr>
+              <w:t xml:space="preserve">50% faster (automated SLA)</w:t>
             </w:r>
           </w:p>
         </w:tc>

</xml_diff>

<commit_message>
fix(auth+ops): page route auth, audit deadlock, KC token parsing, proposal update
- Add cookie-based auth to all HTML page routes (/admin/*, /patients/*)
- Unauthenticated users now redirect to /auth/login instead of seeing pages
- Remove .with_for_update() from AuditService to fix production deadlocks
- Fix Keycloak token parsing for production access tokens without 'sub' claim
- Fix auth login flow: email lookup + KC username for token exchange
- Update proposal doc: tech stack (FastAPI/HTMX), mark Phase 1+2 complete
- Clean up .gitignore for temp deploy/debug scripts
</commit_message>
<xml_diff>
--- a/HMS_Proposal.docx
+++ b/HMS_Proposal.docx
@@ -1,5 +1,27 @@
 
-<file path=word/document.xml><?xml version="1.0" encoding="utf-8"?>
+<file path=docProps\app.xml><?xml version="1.0" encoding="utf-8"?>
+<Properties xmlns="http://schemas.openxmlformats.org/officeDocument/2006/extended-properties" xmlns:vt="http://schemas.openxmlformats.org/officeDocument/2006/docPropsVTypes"/>
+</file>
+
+<file path=docProps\core.xml><?xml version="1.0" encoding="utf-8"?>
+<cp:coreProperties xmlns:cp="http://schemas.openxmlformats.org/package/2006/metadata/core-properties" xmlns:dc="http://purl.org/dc/elements/1.1/" xmlns:dcterms="http://purl.org/dc/terms/" xmlns:dcmitype="http://purl.org/dc/dcmitype/" xmlns:xsi="http://www.w3.org/2001/XMLSchema-instance">
+  <dc:creator>Un-named</dc:creator>
+  <cp:lastModifiedBy>Un-named</cp:lastModifiedBy>
+  <cp:revision>1</cp:revision>
+  <dcterms:created xsi:type="dcterms:W3CDTF">2026-07-14T11:44:04.490Z</dcterms:created>
+  <dcterms:modified xsi:type="dcterms:W3CDTF">2026-07-14T11:44:04.503Z</dcterms:modified>
+</cp:coreProperties>
+</file>
+
+<file path=docProps\custom.xml><?xml version="1.0" encoding="utf-8"?>
+<Properties xmlns="http://schemas.openxmlformats.org/officeDocument/2006/custom-properties" xmlns:vt="http://schemas.openxmlformats.org/officeDocument/2006/docPropsVTypes"/>
+</file>
+
+<file path=word\comments.xml><?xml version="1.0" encoding="utf-8"?>
+<w:comments xmlns:cx="http://schemas.microsoft.com/office/drawing/2014/chartex" xmlns:cx1="http://schemas.microsoft.com/office/drawing/2015/9/8/chartex" xmlns:cx2="http://schemas.microsoft.com/office/drawing/2015/10/21/chartex" xmlns:cx3="http://schemas.microsoft.com/office/drawing/2016/5/9/chartex" xmlns:cx4="http://schemas.microsoft.com/office/drawing/2016/5/10/chartex" xmlns:cx5="http://schemas.microsoft.com/office/drawing/2016/5/11/chartex" xmlns:cx6="http://schemas.microsoft.com/office/drawing/2016/5/12/chartex" xmlns:cx7="http://schemas.microsoft.com/office/drawing/2016/5/13/chartex" xmlns:cx8="http://schemas.microsoft.com/office/drawing/2016/5/14/chartex" xmlns:mc="http://schemas.openxmlformats.org/markup-compatibility/2006" xmlns:aink="http://schemas.microsoft.com/office/drawing/2016/ink" xmlns:am3d="http://schemas.microsoft.com/office/drawing/2017/model3d" xmlns:o="urn:schemas-microsoft-com:office:office" xmlns:r="http://schemas.openxmlformats.org/officeDocument/2006/relationships" xmlns:m="http://schemas.openxmlformats.org/officeDocument/2006/math" xmlns:v="urn:schemas-microsoft-com:vml" xmlns:wp14="http://schemas.microsoft.com/office/word/2010/wordprocessingDrawing" xmlns:wp="http://schemas.openxmlformats.org/drawingml/2006/wordprocessingDrawing" xmlns:w10="urn:schemas-microsoft-com:office:word" xmlns:w="http://schemas.openxmlformats.org/wordprocessingml/2006/main" xmlns:w14="http://schemas.microsoft.com/office/word/2010/wordml" xmlns:w15="http://schemas.microsoft.com/office/word/2012/wordml" xmlns:w16cex="http://schemas.microsoft.com/office/word/2018/wordml/cex" xmlns:w16cid="http://schemas.microsoft.com/office/word/2016/wordml/cid" xmlns:w16="http://schemas.microsoft.com/office/word/2018/wordml" xmlns:w16sdtdh="http://schemas.microsoft.com/office/word/2020/wordml/sdtdatahash" xmlns:w16se="http://schemas.microsoft.com/office/word/2015/wordml/symex" xmlns:wpg="http://schemas.microsoft.com/office/word/2010/wordprocessingGroup" xmlns:wpi="http://schemas.microsoft.com/office/word/2010/wordprocessingInk" xmlns:wne="http://schemas.microsoft.com/office/word/2006/wordml" xmlns:wps="http://schemas.microsoft.com/office/word/2010/wordprocessingShape"/>
+</file>
+
+<file path=word\document.xml><?xml version="1.0" encoding="utf-8"?>
 <w:document xmlns:wpc="http://schemas.microsoft.com/office/word/2010/wordprocessingCanvas" xmlns:mc="http://schemas.openxmlformats.org/markup-compatibility/2006" xmlns:o="urn:schemas-microsoft-com:office:office" xmlns:r="http://schemas.openxmlformats.org/officeDocument/2006/relationships" xmlns:m="http://schemas.openxmlformats.org/officeDocument/2006/math" xmlns:v="urn:schemas-microsoft-com:vml" xmlns:wp14="http://schemas.microsoft.com/office/word/2010/wordprocessingDrawing" xmlns:wp="http://schemas.openxmlformats.org/drawingml/2006/wordprocessingDrawing" xmlns:w10="urn:schemas-microsoft-com:office:word" xmlns:w="http://schemas.openxmlformats.org/wordprocessingml/2006/main" xmlns:w14="http://schemas.microsoft.com/office/word/2010/wordml" xmlns:w15="http://schemas.microsoft.com/office/word/2012/wordml" xmlns:wpg="http://schemas.microsoft.com/office/word/2010/wordprocessingGroup" xmlns:wpi="http://schemas.microsoft.com/office/word/2010/wordprocessingInk" xmlns:wne="http://schemas.microsoft.com/office/word/2006/wordml" xmlns:wps="http://schemas.microsoft.com/office/word/2010/wordprocessingShape" xmlns:cx="http://schemas.microsoft.com/office/drawing/2014/chartex" xmlns:cx1="http://schemas.microsoft.com/office/drawing/2015/9/8/chartex" xmlns:cx2="http://schemas.microsoft.com/office/drawing/2015/10/21/chartex" xmlns:cx3="http://schemas.microsoft.com/office/drawing/2016/5/9/chartex" xmlns:cx4="http://schemas.microsoft.com/office/drawing/2016/5/10/chartex" xmlns:cx5="http://schemas.microsoft.com/office/drawing/2016/5/11/chartex" xmlns:cx6="http://schemas.microsoft.com/office/drawing/2016/5/12/chartex" xmlns:cx7="http://schemas.microsoft.com/office/drawing/2016/5/13/chartex" xmlns:cx8="http://schemas.microsoft.com/office/drawing/2016/5/14/chartex" xmlns:aink="http://schemas.microsoft.com/office/drawing/2016/ink" xmlns:am3d="http://schemas.microsoft.com/office/drawing/2017/model3d" xmlns:w16cex="http://schemas.microsoft.com/office/word/2018/wordml/cex" xmlns:w16cid="http://schemas.microsoft.com/office/word/2016/wordml/cid" xmlns:w16="http://schemas.microsoft.com/office/word/2018/wordml" xmlns:w16sdtdh="http://schemas.microsoft.com/office/word/2020/wordml/sdtdatahash" xmlns:w16se="http://schemas.microsoft.com/office/word/2015/wordml/symex" mc:Ignorable="w14 w15 wp14">
   <w:body>
     <w:p>
@@ -1518,7 +1540,7 @@
                 <w:sz w:val="20"/>
                 <w:szCs w:val="20"/>
               </w:rPr>
-              <w:t xml:space="preserve">React 19 + Next.js 15 (Web), React Native (Mobile)</w:t>
+              <w:t xml:space="preserve">FastAPI + HTMX 2.x + Tailwind CSS 4.x (Web), React Native (Mobile)</w:t>
             </w:r>
           </w:p>
         </w:tc>
@@ -1576,7 +1598,7 @@
                 <w:sz w:val="20"/>
                 <w:szCs w:val="20"/>
               </w:rPr>
-              <w:t xml:space="preserve">NestJS 11 with TypeScript, modular monolith architecture</w:t>
+              <w:t xml:space="preserve">FastAPI 0.115+ (Python 3.11.2), SQLAlchemy 2.x + Alembic, modular monolith architecture</w:t>
             </w:r>
           </w:p>
         </w:tc>
@@ -2243,7 +2265,7 @@
                 <w:sz w:val="20"/>
                 <w:szCs w:val="20"/>
               </w:rPr>
-              <w:t xml:space="preserve">User management, RBAC, MFA, audit logging</w:t>
+              <w:t xml:space="preserve">User management, RBAC, MFA, audit logging ✅ COMPLETED</w:t>
             </w:r>
           </w:p>
         </w:tc>
@@ -2361,7 +2383,7 @@
                 <w:sz w:val="20"/>
                 <w:szCs w:val="20"/>
               </w:rPr>
-              <w:t xml:space="preserve">Registration, profiles, medical history</w:t>
+              <w:t xml:space="preserve">Registration, profiles, medical history, insurance, search, visits ✅ COMPLETED</w:t>
             </w:r>
           </w:p>
         </w:tc>
@@ -4576,11 +4598,7 @@
 </w:document>
 </file>
 
-<file path=word/comments.xml><?xml version="1.0" encoding="utf-8"?>
-<w:comments xmlns:cx="http://schemas.microsoft.com/office/drawing/2014/chartex" xmlns:cx1="http://schemas.microsoft.com/office/drawing/2015/9/8/chartex" xmlns:cx2="http://schemas.microsoft.com/office/drawing/2015/10/21/chartex" xmlns:cx3="http://schemas.microsoft.com/office/drawing/2016/5/9/chartex" xmlns:cx4="http://schemas.microsoft.com/office/drawing/2016/5/10/chartex" xmlns:cx5="http://schemas.microsoft.com/office/drawing/2016/5/11/chartex" xmlns:cx6="http://schemas.microsoft.com/office/drawing/2016/5/12/chartex" xmlns:cx7="http://schemas.microsoft.com/office/drawing/2016/5/13/chartex" xmlns:cx8="http://schemas.microsoft.com/office/drawing/2016/5/14/chartex" xmlns:mc="http://schemas.openxmlformats.org/markup-compatibility/2006" xmlns:aink="http://schemas.microsoft.com/office/drawing/2016/ink" xmlns:am3d="http://schemas.microsoft.com/office/drawing/2017/model3d" xmlns:o="urn:schemas-microsoft-com:office:office" xmlns:r="http://schemas.openxmlformats.org/officeDocument/2006/relationships" xmlns:m="http://schemas.openxmlformats.org/officeDocument/2006/math" xmlns:v="urn:schemas-microsoft-com:vml" xmlns:wp14="http://schemas.microsoft.com/office/word/2010/wordprocessingDrawing" xmlns:wp="http://schemas.openxmlformats.org/drawingml/2006/wordprocessingDrawing" xmlns:w10="urn:schemas-microsoft-com:office:word" xmlns:w="http://schemas.openxmlformats.org/wordprocessingml/2006/main" xmlns:w14="http://schemas.microsoft.com/office/word/2010/wordml" xmlns:w15="http://schemas.microsoft.com/office/word/2012/wordml" xmlns:w16cex="http://schemas.microsoft.com/office/word/2018/wordml/cex" xmlns:w16cid="http://schemas.microsoft.com/office/word/2016/wordml/cid" xmlns:w16="http://schemas.microsoft.com/office/word/2018/wordml" xmlns:w16sdtdh="http://schemas.microsoft.com/office/word/2020/wordml/sdtdatahash" xmlns:w16se="http://schemas.microsoft.com/office/word/2015/wordml/symex" xmlns:wpg="http://schemas.microsoft.com/office/word/2010/wordprocessingGroup" xmlns:wpi="http://schemas.microsoft.com/office/word/2010/wordprocessingInk" xmlns:wne="http://schemas.microsoft.com/office/word/2006/wordml" xmlns:wps="http://schemas.microsoft.com/office/word/2010/wordprocessingShape"/>
-</file>
-
-<file path=word/endnotes.xml><?xml version="1.0" encoding="utf-8"?>
+<file path=word\endnotes.xml><?xml version="1.0" encoding="utf-8"?>
 <w:endnotes xmlns:wpc="http://schemas.microsoft.com/office/word/2010/wordprocessingCanvas" xmlns:mc="http://schemas.openxmlformats.org/markup-compatibility/2006" xmlns:o="urn:schemas-microsoft-com:office:office" xmlns:r="http://schemas.openxmlformats.org/officeDocument/2006/relationships" xmlns:m="http://schemas.openxmlformats.org/officeDocument/2006/math" xmlns:v="urn:schemas-microsoft-com:vml" xmlns:wp14="http://schemas.microsoft.com/office/word/2010/wordprocessingDrawing" xmlns:wp="http://schemas.openxmlformats.org/drawingml/2006/wordprocessingDrawing" xmlns:w10="urn:schemas-microsoft-com:office:word" xmlns:w="http://schemas.openxmlformats.org/wordprocessingml/2006/main" xmlns:w14="http://schemas.microsoft.com/office/word/2010/wordml" xmlns:w15="http://schemas.microsoft.com/office/word/2012/wordml" xmlns:wpg="http://schemas.microsoft.com/office/word/2010/wordprocessingGroup" xmlns:wpi="http://schemas.microsoft.com/office/word/2010/wordprocessingInk" xmlns:wne="http://schemas.microsoft.com/office/word/2006/wordml" xmlns:wps="http://schemas.microsoft.com/office/word/2010/wordprocessingShape" mc:Ignorable="w14 w15 wp14">
   <w:endnote w:type="separator" w:id="-1">
     <w:p>
@@ -4617,7 +4635,11 @@
 </w:endnotes>
 </file>
 
-<file path=word/footer1.xml><?xml version="1.0" encoding="utf-8"?>
+<file path=word\fontTable.xml><?xml version="1.0" encoding="utf-8"?>
+<w:fonts xmlns:mc="http://schemas.openxmlformats.org/markup-compatibility/2006" xmlns:r="http://schemas.openxmlformats.org/officeDocument/2006/relationships" xmlns:w="http://schemas.openxmlformats.org/wordprocessingml/2006/main" xmlns:w14="http://schemas.microsoft.com/office/word/2010/wordml" xmlns:w15="http://schemas.microsoft.com/office/word/2012/wordml" xmlns:w16cex="http://schemas.microsoft.com/office/word/2018/wordml/cex" xmlns:w16cid="http://schemas.microsoft.com/office/word/2016/wordml/cid" xmlns:w16="http://schemas.microsoft.com/office/word/2018/wordml" xmlns:w16sdtdh="http://schemas.microsoft.com/office/word/2020/wordml/sdtdatahash" xmlns:w16se="http://schemas.microsoft.com/office/word/2015/wordml/symex" mc:Ignorable="w14 w15 w16se w16cid w16 w16cex w16sdtdh"/>
+</file>
+
+<file path=word\footer1.xml><?xml version="1.0" encoding="utf-8"?>
 <w:ftr xmlns:wpc="http://schemas.microsoft.com/office/word/2010/wordprocessingCanvas" xmlns:mc="http://schemas.openxmlformats.org/markup-compatibility/2006" xmlns:o="urn:schemas-microsoft-com:office:office" xmlns:r="http://schemas.openxmlformats.org/officeDocument/2006/relationships" xmlns:m="http://schemas.openxmlformats.org/officeDocument/2006/math" xmlns:v="urn:schemas-microsoft-com:vml" xmlns:wp14="http://schemas.microsoft.com/office/word/2010/wordprocessingDrawing" xmlns:wp="http://schemas.openxmlformats.org/drawingml/2006/wordprocessingDrawing" xmlns:w10="urn:schemas-microsoft-com:office:word" xmlns:w="http://schemas.openxmlformats.org/wordprocessingml/2006/main" xmlns:w14="http://schemas.microsoft.com/office/word/2010/wordml" xmlns:w15="http://schemas.microsoft.com/office/word/2012/wordml" xmlns:wpg="http://schemas.microsoft.com/office/word/2010/wordprocessingGroup" xmlns:wpi="http://schemas.microsoft.com/office/word/2010/wordprocessingInk" xmlns:wne="http://schemas.microsoft.com/office/word/2006/wordml" xmlns:wps="http://schemas.microsoft.com/office/word/2010/wordprocessingShape">
   <w:p>
     <w:pPr>
@@ -4649,7 +4671,7 @@
 </w:ftr>
 </file>
 
-<file path=word/footnotes.xml><?xml version="1.0" encoding="utf-8"?>
+<file path=word\footnotes.xml><?xml version="1.0" encoding="utf-8"?>
 <w:footnotes xmlns:wpc="http://schemas.microsoft.com/office/word/2010/wordprocessingCanvas" xmlns:mc="http://schemas.openxmlformats.org/markup-compatibility/2006" xmlns:o="urn:schemas-microsoft-com:office:office" xmlns:r="http://schemas.openxmlformats.org/officeDocument/2006/relationships" xmlns:m="http://schemas.openxmlformats.org/officeDocument/2006/math" xmlns:v="urn:schemas-microsoft-com:vml" xmlns:wp14="http://schemas.microsoft.com/office/word/2010/wordprocessingDrawing" xmlns:wp="http://schemas.openxmlformats.org/drawingml/2006/wordprocessingDrawing" xmlns:w10="urn:schemas-microsoft-com:office:word" xmlns:w="http://schemas.openxmlformats.org/wordprocessingml/2006/main" xmlns:w14="http://schemas.microsoft.com/office/word/2010/wordml" xmlns:w15="http://schemas.microsoft.com/office/word/2012/wordml" xmlns:wpg="http://schemas.microsoft.com/office/word/2010/wordprocessingGroup" xmlns:wpi="http://schemas.microsoft.com/office/word/2010/wordprocessingInk" xmlns:wne="http://schemas.microsoft.com/office/word/2006/wordml" xmlns:wps="http://schemas.microsoft.com/office/word/2010/wordprocessingShape" mc:Ignorable="w14 w15 wp14">
   <w:footnote w:type="separator" w:id="-1">
     <w:p>
@@ -4686,7 +4708,7 @@
 </w:footnotes>
 </file>
 
-<file path=word/header1.xml><?xml version="1.0" encoding="utf-8"?>
+<file path=word\header1.xml><?xml version="1.0" encoding="utf-8"?>
 <w:hdr xmlns:wpc="http://schemas.microsoft.com/office/word/2010/wordprocessingCanvas" xmlns:mc="http://schemas.openxmlformats.org/markup-compatibility/2006" xmlns:o="urn:schemas-microsoft-com:office:office" xmlns:r="http://schemas.openxmlformats.org/officeDocument/2006/relationships" xmlns:m="http://schemas.openxmlformats.org/officeDocument/2006/math" xmlns:v="urn:schemas-microsoft-com:vml" xmlns:wp14="http://schemas.microsoft.com/office/word/2010/wordprocessingDrawing" xmlns:wp="http://schemas.openxmlformats.org/drawingml/2006/wordprocessingDrawing" xmlns:w10="urn:schemas-microsoft-com:office:word" xmlns:w="http://schemas.openxmlformats.org/wordprocessingml/2006/main" xmlns:w14="http://schemas.microsoft.com/office/word/2010/wordml" xmlns:w15="http://schemas.microsoft.com/office/word/2012/wordml" xmlns:wpg="http://schemas.microsoft.com/office/word/2010/wordprocessingGroup" xmlns:wpi="http://schemas.microsoft.com/office/word/2010/wordprocessingInk" xmlns:wne="http://schemas.microsoft.com/office/word/2006/wordml" xmlns:wps="http://schemas.microsoft.com/office/word/2010/wordprocessingShape" xmlns:cx="http://schemas.microsoft.com/office/drawing/2014/chartex" xmlns:cx1="http://schemas.microsoft.com/office/drawing/2015/9/8/chartex" xmlns:cx2="http://schemas.microsoft.com/office/drawing/2015/10/21/chartex" xmlns:cx3="http://schemas.microsoft.com/office/drawing/2016/5/9/chartex" xmlns:cx4="http://schemas.microsoft.com/office/drawing/2016/5/10/chartex" xmlns:cx5="http://schemas.microsoft.com/office/drawing/2016/5/11/chartex" xmlns:cx6="http://schemas.microsoft.com/office/drawing/2016/5/12/chartex" xmlns:cx7="http://schemas.microsoft.com/office/drawing/2016/5/13/chartex" xmlns:cx8="http://schemas.microsoft.com/office/drawing/2016/5/14/chartex" xmlns:w16cid="http://schemas.microsoft.com/office/word/2016/wordml/cid" xmlns:w16se="http://schemas.microsoft.com/office/word/2015/wordml/symex">
   <w:p>
     <w:pPr>
@@ -4722,7 +4744,7 @@
 </w:hdr>
 </file>
 
-<file path=word/numbering.xml><?xml version="1.0" encoding="utf-8"?>
+<file path=word\numbering.xml><?xml version="1.0" encoding="utf-8"?>
 <w:numbering xmlns:wpc="http://schemas.microsoft.com/office/word/2010/wordprocessingCanvas" xmlns:mc="http://schemas.openxmlformats.org/markup-compatibility/2006" xmlns:o="urn:schemas-microsoft-com:office:office" xmlns:r="http://schemas.openxmlformats.org/officeDocument/2006/relationships" xmlns:m="http://schemas.openxmlformats.org/officeDocument/2006/math" xmlns:v="urn:schemas-microsoft-com:vml" xmlns:wp14="http://schemas.microsoft.com/office/word/2010/wordprocessingDrawing" xmlns:wp="http://schemas.openxmlformats.org/drawingml/2006/wordprocessingDrawing" xmlns:w10="urn:schemas-microsoft-com:office:word" xmlns:w="http://schemas.openxmlformats.org/wordprocessingml/2006/main" xmlns:w14="http://schemas.microsoft.com/office/word/2010/wordml" xmlns:w15="http://schemas.microsoft.com/office/word/2012/wordml" xmlns:wpg="http://schemas.microsoft.com/office/word/2010/wordprocessingGroup" xmlns:wpi="http://schemas.microsoft.com/office/word/2010/wordprocessingInk" xmlns:wne="http://schemas.microsoft.com/office/word/2006/wordml" xmlns:wps="http://schemas.microsoft.com/office/word/2010/wordprocessingShape" mc:Ignorable="w14 w15 wp14">
   <w:abstractNum w:abstractNumId="1" w15:restartNumberingAfterBreak="0">
     <w:multiLevelType w:val="hybridMultilevel"/>
@@ -4871,7 +4893,17 @@
 </w:numbering>
 </file>
 
-<file path=word/styles.xml><?xml version="1.0" encoding="utf-8"?>
+<file path=word\settings.xml><?xml version="1.0" encoding="utf-8"?>
+<w:settings xmlns:wpc="http://schemas.microsoft.com/office/word/2010/wordprocessingCanvas" xmlns:mc="http://schemas.openxmlformats.org/markup-compatibility/2006" xmlns:o="urn:schemas-microsoft-com:office:office" xmlns:r="http://schemas.openxmlformats.org/officeDocument/2006/relationships" xmlns:m="http://schemas.openxmlformats.org/officeDocument/2006/math" xmlns:v="urn:schemas-microsoft-com:vml" xmlns:wp14="http://schemas.microsoft.com/office/word/2010/wordprocessingDrawing" xmlns:wp="http://schemas.openxmlformats.org/drawingml/2006/wordprocessingDrawing" xmlns:w10="urn:schemas-microsoft-com:office:word" xmlns:w="http://schemas.openxmlformats.org/wordprocessingml/2006/main" xmlns:w14="http://schemas.microsoft.com/office/word/2010/wordml" xmlns:w15="http://schemas.microsoft.com/office/word/2012/wordml" xmlns:wpg="http://schemas.microsoft.com/office/word/2010/wordprocessingGroup" xmlns:wpi="http://schemas.microsoft.com/office/word/2010/wordprocessingInk" xmlns:wne="http://schemas.microsoft.com/office/word/2006/wordml" xmlns:wps="http://schemas.microsoft.com/office/word/2010/wordprocessingShape" mc:Ignorable="w14 w15 wp14">
+  <w:displayBackgroundShape/>
+  <w:evenAndOddHeaders w:val="false"/>
+  <w:compat>
+    <w:compatSetting w:val="15" w:name="compatibilityMode" w:uri="http://schemas.microsoft.com/office/word"/>
+  </w:compat>
+</w:settings>
+</file>
+
+<file path=word\styles.xml><?xml version="1.0" encoding="utf-8"?>
 <w:styles xmlns:mc="http://schemas.openxmlformats.org/markup-compatibility/2006" xmlns:r="http://schemas.openxmlformats.org/officeDocument/2006/relationships" xmlns:w="http://schemas.openxmlformats.org/wordprocessingml/2006/main" xmlns:w14="http://schemas.microsoft.com/office/word/2010/wordml" xmlns:w15="http://schemas.microsoft.com/office/word/2012/wordml" mc:Ignorable="w14 w15">
   <w:docDefaults>
     <w:rPrDefault>

</xml_diff>